<commit_message>
Update academic year to 2026-27 and submission month to October 2026
Co-Authored-By: Claude Opus 5.5 <noreply@anthropic.com>
Claude-Session: https://claude.ai/code/session_018jJCv87Bguhzy4ygSM2vUs
</commit_message>
<xml_diff>
--- a/Cybersecurity_Awareness_Survey_Among_Students_20pg.docx
+++ b/Cybersecurity_Awareness_Survey_Among_Students_20pg.docx
@@ -205,7 +205,7 @@
           <w:sz w:val="24"/>
           <w:szCs w:val="24"/>
         </w:rPr>
-        <w:t xml:space="preserve"> - 2025-26</w:t>
+        <w:t xml:space="preserve"> - 2026-27</w:t>
       </w:r>
     </w:p>
     <w:p>
@@ -229,7 +229,7 @@
           <w:sz w:val="24"/>
           <w:szCs w:val="24"/>
         </w:rPr>
-        <w:t xml:space="preserve">December - 2025</w:t>
+        <w:t xml:space="preserve">October - 2026</w:t>
       </w:r>
     </w:p>
     <w:p>
@@ -262,7 +262,7 @@
           <w:sz w:val="24"/>
           <w:szCs w:val="24"/>
         </w:rPr>
-        <w:t xml:space="preserve">I, Riya Jiledar Singh, a student of J.K. College of Science and Commerce studying in S.Y.B.Sc. Computer Science, hereby declare that I have completed the field project entitled “Cybersecurity Awareness Survey Among Students” during the academic year 2025-2026.</w:t>
+        <w:t xml:space="preserve">I, Riya Jiledar Singh, a student of J.K. College of Science and Commerce studying in S.Y.B.Sc. Computer Science, hereby declare that I have completed the field project entitled “Cybersecurity Awareness Survey Among Students” during the academic year 2026-2027.</w:t>
       </w:r>
     </w:p>
     <w:p>

</xml_diff>

<commit_message>
Update student name and roll number
Co-Authored-By: Claude Opus 5.5 <noreply@anthropic.com>
Claude-Session: https://claude.ai/code/session_018jJCv87Bguhzy4ygSM2vUs
</commit_message>
<xml_diff>
--- a/Cybersecurity_Awareness_Survey_Among_Students_20pg.docx
+++ b/Cybersecurity_Awareness_Survey_Among_Students_20pg.docx
@@ -85,7 +85,7 @@
           <w:sz w:val="24"/>
           <w:szCs w:val="24"/>
         </w:rPr>
-        <w:t xml:space="preserve">Riya Jiledar Singh</w:t>
+        <w:t xml:space="preserve">Anamika Singh</w:t>
       </w:r>
     </w:p>
     <w:p>
@@ -109,7 +109,7 @@
           <w:sz w:val="24"/>
           <w:szCs w:val="24"/>
         </w:rPr>
-        <w:t xml:space="preserve">2026011109</w:t>
+        <w:t xml:space="preserve">2026011108</w:t>
       </w:r>
     </w:p>
     <w:p>
@@ -262,7 +262,7 @@
           <w:sz w:val="24"/>
           <w:szCs w:val="24"/>
         </w:rPr>
-        <w:t xml:space="preserve">I, Riya Jiledar Singh, a student of J.K. College of Science and Commerce studying in S.Y.B.Sc. Computer Science, hereby declare that I have completed the field project entitled “Cybersecurity Awareness Survey Among Students” during the academic year 2026-2027.</w:t>
+        <w:t xml:space="preserve">I, Anamika Singh, a student of J.K. College of Science and Commerce studying in S.Y.B.Sc. Computer Science, hereby declare that I have completed the field project entitled “Cybersecurity Awareness Survey Among Students” during the academic year 2026-2027.</w:t>
       </w:r>
     </w:p>
     <w:p>
@@ -356,7 +356,7 @@
           <w:sz w:val="24"/>
           <w:szCs w:val="24"/>
         </w:rPr>
-        <w:t xml:space="preserve">Riya Jiledar Singh</w:t>
+        <w:t xml:space="preserve">Anamika Singh</w:t>
       </w:r>
     </w:p>
     <w:p>

</xml_diff>